<commit_message>
Batch 1: Remake Ma 22, Joey 22, expand Ma 23 with announcement + note
</commit_message>
<xml_diff>
--- a/stories/docx/Joey 22.docx
+++ b/stories/docx/Joey 22.docx
@@ -15,7 +15,7 @@
         <w:pStyle w:val="BodyText"/>
       </w:pPr>
       <w:r>
-        <w:t xml:space="preserve">He is home. Frank is home.</w:t>
+        <w:t xml:space="preserve">I am on a ship. Heading home. That is the only thing that matters.</w:t>
       </w:r>
     </w:p>
     <w:p>
@@ -23,7 +23,7 @@
         <w:pStyle w:val="BodyText"/>
       </w:pPr>
       <w:r>
-        <w:t xml:space="preserve">I am writing this at the kitchen table, and I cannot make my hand stop shaking. Not from fear. From something else. Something I do not have a word for. Joy, maybe. Relief. Something bigger than both.</w:t>
+        <w:t xml:space="preserve">War is over. Germans surrendered. I heard the news and I could not breathe. All I could think was: I am getting off this thing and going back to my brother. Back to my mother. Back to the store.</w:t>
       </w:r>
     </w:p>
     <w:p>
@@ -31,7 +31,7 @@
         <w:pStyle w:val="BodyText"/>
       </w:pPr>
       <w:r>
-        <w:t xml:space="preserve">The door opened, and there he was. Thinner than when he left. A cane in his hand. And behind him — Lucia. She was smaller than I expected, and her eyes were like nothing I had ever seen. Dark, deep, like she was always looking at something farther than anyone else could see. She looked at me, and I looked at her, and neither of us spoke for a long moment. Then she smiled, just slightly.</w:t>
+        <w:t xml:space="preserve">I got hit. Leg and shoulder. Shrapnel from a grenade — the real thing, the kind that tears through you and does not care who you are. Not going to lie to you — it is bad. I will walk again, but not the way I used to. The doctors are talking months of therapy, learning to walk again, relearning everything. I do not care. I am alive. I am coming home.</w:t>
       </w:r>
     </w:p>
     <w:p>
@@ -39,7 +39,7 @@
         <w:pStyle w:val="BodyText"/>
       </w:pPr>
       <w:r>
-        <w:t xml:space="preserve">Ma screamed. Not in a bad way. In the way mothers do when they have been waiting forever and then the waiting is over. She ran to him and held him so hard I thought she would break something, and he held her back, and neither of them said anything. Nothing needed to be said.</w:t>
+        <w:t xml:space="preserve">Lucia is here. She came with me. She refused to stay behind, refused to let me go alone. That is the kind of woman she is. She has survived things I cannot explain — tunnels, German soldiers, an entire war — and she walked away from all of it to be with me. You will meet her soon. She has dark eyes and a quiet way about her, but do not mistake that for weakness. She is the strongest person I have ever known.</w:t>
       </w:r>
     </w:p>
     <w:p>
@@ -47,7 +47,7 @@
         <w:pStyle w:val="BodyText"/>
       </w:pPr>
       <w:r>
-        <w:t xml:space="preserve">And then Frank looked at me. He did not smile at first. He just looked. And I looked back. And then he crossed the room and grabbed me — the same way he always did, the same way he did when we were kids — and he held on.</w:t>
+        <w:t xml:space="preserve">Now, Joey — I need to ask you something, and I need you to tell me the truth in your reply.</w:t>
       </w:r>
     </w:p>
     <w:p>
@@ -55,177 +55,51 @@
         <w:pStyle w:val="BodyText"/>
       </w:pPr>
       <w:r>
-        <w:t xml:space="preserve">“</w:t>
-      </w:r>
-      <w:r>
-        <w:t xml:space="preserve">So,</w:t>
-      </w:r>
-      <w:r>
-        <w:t xml:space="preserve">”</w:t>
+        <w:t xml:space="preserve">The Greek. What happened with the Greek? I have been thinking about it the whole voyage. About whether he made his move while I was gone. About whether you held the line. About whether you and Ma are safe.</w:t>
+      </w:r>
+    </w:p>
+    <w:p>
+      <w:pPr>
+        <w:pStyle w:val="BodyText"/>
+      </w:pPr>
+      <w:r>
+        <w:t xml:space="preserve">I know you told me to trust you. I did. I do. But I need to know. When I get home, is the store still ours? Did he try to take it? Did he hurt anyone? Did you handle it?</w:t>
+      </w:r>
+    </w:p>
+    <w:p>
+      <w:pPr>
+        <w:pStyle w:val="BodyText"/>
+      </w:pPr>
+      <w:r>
+        <w:t xml:space="preserve">I am not going to pretend I was not worried. Every night on this ship, I lay awake and thought about you. About Ma. About whether the Greek finally made his move. About whether I would come home to an empty apartment or a broken store.</w:t>
+      </w:r>
+    </w:p>
+    <w:p>
+      <w:pPr>
+        <w:pStyle w:val="BodyText"/>
+      </w:pPr>
+      <w:r>
+        <w:t xml:space="preserve">Write to me. Tell me everything. I can take it.</w:t>
+      </w:r>
+    </w:p>
+    <w:p>
+      <w:pPr>
+        <w:pStyle w:val="BodyText"/>
+      </w:pPr>
+      <w:r>
+        <w:t xml:space="preserve">I am coming home, Joey. And I am bringing Lucia. And I am so ready to see you. I have your rosary with me, the one Ma gave me. I held it through the war. I will hold it all the way home.</w:t>
+      </w:r>
+    </w:p>
+    <w:p>
+      <w:pPr>
+        <w:pStyle w:val="BodyText"/>
+      </w:pPr>
+      <w:r>
+        <w:t xml:space="preserve">Your brother,</w:t>
       </w:r>
       <w:r>
         <w:t xml:space="preserve"> </w:t>
       </w:r>
-      <w:r>
-        <w:t xml:space="preserve">he said,</w:t>
-      </w:r>
-      <w:r>
-        <w:t xml:space="preserve"> </w:t>
-      </w:r>
-      <w:r>
-        <w:t xml:space="preserve">“</w:t>
-      </w:r>
-      <w:r>
-        <w:t xml:space="preserve">the Greek.</w:t>
-      </w:r>
-      <w:r>
-        <w:t xml:space="preserve">”</w:t>
-      </w:r>
-    </w:p>
-    <w:p>
-      <w:pPr>
-        <w:pStyle w:val="BodyText"/>
-      </w:pPr>
-      <w:r>
-        <w:t xml:space="preserve">“</w:t>
-      </w:r>
-      <w:r>
-        <w:t xml:space="preserve">Gone,</w:t>
-      </w:r>
-      <w:r>
-        <w:t xml:space="preserve">”</w:t>
-      </w:r>
-      <w:r>
-        <w:t xml:space="preserve"> </w:t>
-      </w:r>
-      <w:r>
-        <w:t xml:space="preserve">I said.</w:t>
-      </w:r>
-      <w:r>
-        <w:t xml:space="preserve"> </w:t>
-      </w:r>
-      <w:r>
-        <w:t xml:space="preserve">“</w:t>
-      </w:r>
-      <w:r>
-        <w:t xml:space="preserve">We handled it. Took care of it. The store is still ours.</w:t>
-      </w:r>
-      <w:r>
-        <w:t xml:space="preserve">”</w:t>
-      </w:r>
-    </w:p>
-    <w:p>
-      <w:pPr>
-        <w:pStyle w:val="BodyText"/>
-      </w:pPr>
-      <w:r>
-        <w:t xml:space="preserve">He nodded. That was enough. He did not need to ask more. He could see it in my face, in the way I stood, in the way the store looked. He knew.</w:t>
-      </w:r>
-    </w:p>
-    <w:p>
-      <w:pPr>
-        <w:pStyle w:val="BodyText"/>
-      </w:pPr>
-      <w:r>
-        <w:t xml:space="preserve">Lucia stood in the doorway. She was looking at everything — the counter, the shelves, the window, the kitchen. And she smiled. That smile Frank told me about. The one that could make a man follow her anywhere. The one that told stories I could not imagine.</w:t>
-      </w:r>
-    </w:p>
-    <w:p>
-      <w:pPr>
-        <w:pStyle w:val="BodyText"/>
-      </w:pPr>
-      <w:r>
-        <w:t xml:space="preserve">“</w:t>
-      </w:r>
-      <w:r>
-        <w:t xml:space="preserve">So you must be Joey,</w:t>
-      </w:r>
-      <w:r>
-        <w:t xml:space="preserve">”</w:t>
-      </w:r>
-      <w:r>
-        <w:t xml:space="preserve"> </w:t>
-      </w:r>
-      <w:r>
-        <w:t xml:space="preserve">she said.</w:t>
-      </w:r>
-    </w:p>
-    <w:p>
-      <w:pPr>
-        <w:pStyle w:val="BodyText"/>
-      </w:pPr>
-      <w:r>
-        <w:t xml:space="preserve">“</w:t>
-      </w:r>
-      <w:r>
-        <w:t xml:space="preserve">And you must be Lucia,</w:t>
-      </w:r>
-      <w:r>
-        <w:t xml:space="preserve">”</w:t>
-      </w:r>
-      <w:r>
-        <w:t xml:space="preserve"> </w:t>
-      </w:r>
-      <w:r>
-        <w:t xml:space="preserve">I said.</w:t>
-      </w:r>
-    </w:p>
-    <w:p>
-      <w:pPr>
-        <w:pStyle w:val="BodyText"/>
-      </w:pPr>
-      <w:r>
-        <w:t xml:space="preserve">We shook hands. Her grip was stronger than I expected. This was a woman who had been through things I would never understand. A woman who had hidden in tunnels, who had led people to safety, who had survived a war. And now she was here, in our store, in our home.</w:t>
-      </w:r>
-    </w:p>
-    <w:p>
-      <w:pPr>
-        <w:pStyle w:val="BodyText"/>
-      </w:pPr>
-      <w:r>
-        <w:t xml:space="preserve">Tonight, we all sat at the table. Ma made enough food for an army. Lucia tried everything, asked questions about everything. Frank watched her, and every time she laughed, he smiled. That smile I had not seen in years.</w:t>
-      </w:r>
-    </w:p>
-    <w:p>
-      <w:pPr>
-        <w:pStyle w:val="BodyText"/>
-      </w:pPr>
-      <w:r>
-        <w:t xml:space="preserve">I told Frank about the Greek. All of it. The letters, the threats, the break-in, the police. He listened, and when I was done, he said,</w:t>
-      </w:r>
-      <w:r>
-        <w:t xml:space="preserve"> </w:t>
-      </w:r>
-      <w:r>
-        <w:t xml:space="preserve">“</w:t>
-      </w:r>
-      <w:r>
-        <w:t xml:space="preserve">You did good, Joey. Real good. I knew you could. I always knew.</w:t>
-      </w:r>
-      <w:r>
-        <w:t xml:space="preserve">”</w:t>
-      </w:r>
-    </w:p>
-    <w:p>
-      <w:pPr>
-        <w:pStyle w:val="BodyText"/>
-      </w:pPr>
-      <w:r>
-        <w:t xml:space="preserve">That is all I needed to hear.</w:t>
-      </w:r>
-    </w:p>
-    <w:p>
-      <w:pPr>
-        <w:pStyle w:val="BodyText"/>
-      </w:pPr>
-      <w:r>
-        <w:t xml:space="preserve">Stay sharp.</w:t>
-      </w:r>
-    </w:p>
-    <w:p>
-      <w:pPr>
-        <w:pStyle w:val="BodyText"/>
-      </w:pPr>
       <w:r>
         <w:t xml:space="preserve">Frank</w:t>
       </w:r>

</xml_diff>